<commit_message>
Cleaned up dissection lesson and worksheet.
</commit_message>
<xml_diff>
--- a/CourseMaterials/06_computer_hardware/01_computer_dissection/computer_dissection.docx
+++ b/CourseMaterials/06_computer_hardware/01_computer_dissection/computer_dissection.docx
@@ -1,6 +1,6 @@
 
 <file path=word/document.xml><?xml version="1.0" encoding="utf-8"?>
-<w:document xmlns:wpc="http://schemas.microsoft.com/office/word/2010/wordprocessingCanvas" xmlns:cx="http://schemas.microsoft.com/office/drawing/2014/chartex" xmlns:cx1="http://schemas.microsoft.com/office/drawing/2015/9/8/chartex" xmlns:cx2="http://schemas.microsoft.com/office/drawing/2015/10/21/chartex" xmlns:cx3="http://schemas.microsoft.com/office/drawing/2016/5/9/chartex" xmlns:cx4="http://schemas.microsoft.com/office/drawing/2016/5/10/chartex" xmlns:cx5="http://schemas.microsoft.com/office/drawing/2016/5/11/chartex" xmlns:cx6="http://schemas.microsoft.com/office/drawing/2016/5/12/chartex" xmlns:cx7="http://schemas.microsoft.com/office/drawing/2016/5/13/chartex" xmlns:cx8="http://schemas.microsoft.com/office/drawing/2016/5/14/chartex" xmlns:mc="http://schemas.openxmlformats.org/markup-compatibility/2006" xmlns:aink="http://schemas.microsoft.com/office/drawing/2016/ink" xmlns:am3d="http://schemas.microsoft.com/office/drawing/2017/model3d" xmlns:o="urn:schemas-microsoft-com:office:office" xmlns:oel="http://schemas.microsoft.com/office/2019/extlst" xmlns:r="http://schemas.openxmlformats.org/officeDocument/2006/relationships" xmlns:m="http://schemas.openxmlformats.org/officeDocument/2006/math" xmlns:v="urn:schemas-microsoft-com:vml" xmlns:wp14="http://schemas.microsoft.com/office/word/2010/wordprocessingDrawing" xmlns:wp="http://schemas.openxmlformats.org/drawingml/2006/wordprocessingDrawing" xmlns:w10="urn:schemas-microsoft-com:office:word" xmlns:w="http://schemas.openxmlformats.org/wordprocessingml/2006/main" xmlns:w14="http://schemas.microsoft.com/office/word/2010/wordml" xmlns:w15="http://schemas.microsoft.com/office/word/2012/wordml" xmlns:w16cex="http://schemas.microsoft.com/office/word/2018/wordml/cex" xmlns:w16cid="http://schemas.microsoft.com/office/word/2016/wordml/cid" xmlns:w16="http://schemas.microsoft.com/office/word/2018/wordml" xmlns:w16sdtdh="http://schemas.microsoft.com/office/word/2020/wordml/sdtdatahash" xmlns:w16se="http://schemas.microsoft.com/office/word/2015/wordml/symex" xmlns:wpg="http://schemas.microsoft.com/office/word/2010/wordprocessingGroup" xmlns:wpi="http://schemas.microsoft.com/office/word/2010/wordprocessingInk" xmlns:wne="http://schemas.microsoft.com/office/word/2006/wordml" xmlns:wps="http://schemas.microsoft.com/office/word/2010/wordprocessingShape" mc:Ignorable="w14 w15 w16se w16cid w16 w16cex w16sdtdh wp14">
+<w:document xmlns:wpc="http://schemas.microsoft.com/office/word/2010/wordprocessingCanvas" xmlns:cx="http://schemas.microsoft.com/office/drawing/2014/chartex" xmlns:cx1="http://schemas.microsoft.com/office/drawing/2015/9/8/chartex" xmlns:cx2="http://schemas.microsoft.com/office/drawing/2015/10/21/chartex" xmlns:cx3="http://schemas.microsoft.com/office/drawing/2016/5/9/chartex" xmlns:cx4="http://schemas.microsoft.com/office/drawing/2016/5/10/chartex" xmlns:cx5="http://schemas.microsoft.com/office/drawing/2016/5/11/chartex" xmlns:cx6="http://schemas.microsoft.com/office/drawing/2016/5/12/chartex" xmlns:cx7="http://schemas.microsoft.com/office/drawing/2016/5/13/chartex" xmlns:cx8="http://schemas.microsoft.com/office/drawing/2016/5/14/chartex" xmlns:mc="http://schemas.openxmlformats.org/markup-compatibility/2006" xmlns:aink="http://schemas.microsoft.com/office/drawing/2016/ink" xmlns:am3d="http://schemas.microsoft.com/office/drawing/2017/model3d" xmlns:o="urn:schemas-microsoft-com:office:office" xmlns:oel="http://schemas.microsoft.com/office/2019/extlst" xmlns:r="http://schemas.openxmlformats.org/officeDocument/2006/relationships" xmlns:m="http://schemas.openxmlformats.org/officeDocument/2006/math" xmlns:v="urn:schemas-microsoft-com:vml" xmlns:wp14="http://schemas.microsoft.com/office/word/2010/wordprocessingDrawing" xmlns:wp="http://schemas.openxmlformats.org/drawingml/2006/wordprocessingDrawing" xmlns:w10="urn:schemas-microsoft-com:office:word" xmlns:w="http://schemas.openxmlformats.org/wordprocessingml/2006/main" xmlns:w14="http://schemas.microsoft.com/office/word/2010/wordml" xmlns:w15="http://schemas.microsoft.com/office/word/2012/wordml" xmlns:w16cex="http://schemas.microsoft.com/office/word/2018/wordml/cex" xmlns:w16cid="http://schemas.microsoft.com/office/word/2016/wordml/cid" xmlns:w16="http://schemas.microsoft.com/office/word/2018/wordml" xmlns:w16du="http://schemas.microsoft.com/office/word/2023/wordml/word16du" xmlns:w16sdtdh="http://schemas.microsoft.com/office/word/2020/wordml/sdtdatahash" xmlns:w16se="http://schemas.microsoft.com/office/word/2015/wordml/symex" xmlns:wpg="http://schemas.microsoft.com/office/word/2010/wordprocessingGroup" xmlns:wpi="http://schemas.microsoft.com/office/word/2010/wordprocessingInk" xmlns:wne="http://schemas.microsoft.com/office/word/2006/wordml" xmlns:wps="http://schemas.microsoft.com/office/word/2010/wordprocessingShape" mc:Ignorable="w14 w15 w16se w16cid w16 w16cex w16sdtdh w16du wp14">
   <w:body>
     <w:p>
       <w:pPr>
@@ -38,7 +38,7 @@
         <w:rPr>
           <w:rFonts w:ascii="Garamond" w:hAnsi="Garamond"/>
         </w:rPr>
-        <w:t>Today we are going to carefully take apart a computer and see what’s inside. As you go, take careful note of the pieces that your encounter and use your observations to answer the following questions:</w:t>
+        <w:t>Today we are going to take apart a computer and see what’s inside. As you go, take note of the pieces that your encounter and use your observations to answer the following questions:</w:t>
       </w:r>
     </w:p>
     <w:p>
@@ -256,7 +256,21 @@
           <w:rFonts w:ascii="Garamond" w:hAnsi="Garamond"/>
           <w:color w:val="000000"/>
         </w:rPr>
-        <w:t>Draw a rough sketch of the memory:</w:t>
+        <w:t>Draw a rough sketch of the memory</w:t>
+      </w:r>
+      <w:r>
+        <w:rPr>
+          <w:rFonts w:ascii="Garamond" w:hAnsi="Garamond"/>
+          <w:color w:val="000000"/>
+        </w:rPr>
+        <w:t xml:space="preserve"> (RAM)</w:t>
+      </w:r>
+      <w:r>
+        <w:rPr>
+          <w:rFonts w:ascii="Garamond" w:hAnsi="Garamond"/>
+          <w:color w:val="000000"/>
+        </w:rPr>
+        <w:t>:</w:t>
       </w:r>
     </w:p>
     <w:p>
@@ -492,14 +506,14 @@
           <w:color w:val="000000"/>
         </w:rPr>
         <w:lastRenderedPageBreak/>
-        <w:t xml:space="preserve">Look at the top of the CPU (you might have to scrape off some </w:t>
-      </w:r>
-      <w:r>
-        <w:rPr>
-          <w:rFonts w:ascii="Garamond" w:hAnsi="Garamond"/>
-          <w:color w:val="000000"/>
-        </w:rPr>
-        <w:t xml:space="preserve">of the </w:t>
+        <w:t>Look at the top of the CPU (you might have to scrape off some</w:t>
+      </w:r>
+      <w:r>
+        <w:rPr>
+          <w:rFonts w:ascii="Garamond" w:hAnsi="Garamond"/>
+          <w:color w:val="000000"/>
+        </w:rPr>
+        <w:t xml:space="preserve"> </w:t>
       </w:r>
       <w:r>
         <w:rPr>
@@ -520,7 +534,7 @@
           <w:rFonts w:ascii="Garamond" w:hAnsi="Garamond"/>
           <w:color w:val="000000"/>
         </w:rPr>
-        <w:t>glue</w:t>
+        <w:t>paste</w:t>
       </w:r>
       <w:r>
         <w:rPr>
@@ -551,25 +565,22 @@
         <w:pStyle w:val="Standard"/>
         <w:rPr>
           <w:rFonts w:ascii="Garamond" w:hAnsi="Garamond"/>
-          <w:color w:val="000000"/>
-        </w:rPr>
-      </w:pPr>
-    </w:p>
-    <w:p>
-      <w:pPr>
-        <w:pStyle w:val="Standard"/>
-        <w:rPr>
-          <w:rFonts w:ascii="Garamond" w:hAnsi="Garamond"/>
-          <w:color w:val="000000"/>
-        </w:rPr>
-      </w:pPr>
-    </w:p>
-    <w:p>
-      <w:pPr>
-        <w:pStyle w:val="Standard"/>
-        <w:rPr>
-          <w:rFonts w:ascii="Garamond" w:hAnsi="Garamond"/>
-          <w:color w:val="000000"/>
+        </w:rPr>
+      </w:pPr>
+    </w:p>
+    <w:p>
+      <w:pPr>
+        <w:pStyle w:val="Standard"/>
+        <w:rPr>
+          <w:rFonts w:ascii="Garamond" w:hAnsi="Garamond"/>
+        </w:rPr>
+      </w:pPr>
+    </w:p>
+    <w:p>
+      <w:pPr>
+        <w:pStyle w:val="Standard"/>
+        <w:rPr>
+          <w:rFonts w:ascii="Garamond" w:hAnsi="Garamond"/>
         </w:rPr>
       </w:pPr>
     </w:p>
@@ -587,70 +598,53 @@
       <w:r>
         <w:rPr>
           <w:rFonts w:ascii="Garamond" w:hAnsi="Garamond"/>
-          <w:color w:val="000000"/>
-        </w:rPr>
-        <w:t xml:space="preserve">Look at the </w:t>
-      </w:r>
-      <w:r>
-        <w:rPr>
-          <w:rFonts w:ascii="Garamond" w:hAnsi="Garamond"/>
-          <w:color w:val="000000"/>
-        </w:rPr>
-        <w:t>sticker on the sides</w:t>
-      </w:r>
-      <w:r>
-        <w:rPr>
-          <w:rFonts w:ascii="Garamond" w:hAnsi="Garamond"/>
-          <w:color w:val="000000"/>
-        </w:rPr>
-        <w:t xml:space="preserve"> of one of the memory sticks. How many GBs does it store? In English, explain what this means.</w:t>
-      </w:r>
-    </w:p>
-    <w:p>
-      <w:pPr>
-        <w:pStyle w:val="Standard"/>
-        <w:ind w:left="360"/>
-        <w:rPr>
-          <w:rFonts w:ascii="Garamond" w:hAnsi="Garamond"/>
-          <w:color w:val="000000"/>
-        </w:rPr>
-      </w:pPr>
-    </w:p>
-    <w:p>
-      <w:pPr>
-        <w:pStyle w:val="Standard"/>
-        <w:ind w:left="360"/>
-        <w:rPr>
-          <w:rFonts w:ascii="Garamond" w:hAnsi="Garamond"/>
-          <w:color w:val="000000"/>
-        </w:rPr>
-      </w:pPr>
-    </w:p>
-    <w:p>
-      <w:pPr>
-        <w:pStyle w:val="Standard"/>
-        <w:ind w:left="360"/>
-        <w:rPr>
-          <w:rFonts w:ascii="Garamond" w:hAnsi="Garamond"/>
-          <w:color w:val="000000"/>
-        </w:rPr>
-      </w:pPr>
-    </w:p>
-    <w:p>
-      <w:pPr>
-        <w:pStyle w:val="Standard"/>
-        <w:ind w:left="360"/>
-        <w:rPr>
-          <w:rFonts w:ascii="Garamond" w:hAnsi="Garamond"/>
-        </w:rPr>
-      </w:pPr>
-    </w:p>
-    <w:p>
-      <w:pPr>
-        <w:pStyle w:val="Standard"/>
-        <w:ind w:left="360"/>
-        <w:rPr>
-          <w:rFonts w:ascii="Garamond" w:hAnsi="Garamond"/>
+        </w:rPr>
+        <w:t xml:space="preserve">Look at the top of the hard drive. How many </w:t>
+      </w:r>
+      <w:r>
+        <w:rPr>
+          <w:rFonts w:ascii="Garamond" w:hAnsi="Garamond"/>
+        </w:rPr>
+        <w:t>G</w:t>
+      </w:r>
+      <w:r>
+        <w:rPr>
+          <w:rFonts w:ascii="Garamond" w:hAnsi="Garamond"/>
+        </w:rPr>
+        <w:t>Bs does it store? In English, explain what this means.</w:t>
+      </w:r>
+    </w:p>
+    <w:p>
+      <w:pPr>
+        <w:pStyle w:val="Standard"/>
+        <w:rPr>
+          <w:rFonts w:ascii="Garamond" w:hAnsi="Garamond"/>
+        </w:rPr>
+      </w:pPr>
+    </w:p>
+    <w:p>
+      <w:pPr>
+        <w:pStyle w:val="Standard"/>
+        <w:rPr>
+          <w:rFonts w:ascii="Garamond" w:hAnsi="Garamond"/>
+        </w:rPr>
+      </w:pPr>
+    </w:p>
+    <w:p>
+      <w:pPr>
+        <w:pStyle w:val="Standard"/>
+        <w:rPr>
+          <w:rFonts w:ascii="Garamond" w:hAnsi="Garamond"/>
+          <w:color w:val="000000"/>
+        </w:rPr>
+      </w:pPr>
+    </w:p>
+    <w:p>
+      <w:pPr>
+        <w:pStyle w:val="Standard"/>
+        <w:rPr>
+          <w:rFonts w:ascii="Garamond" w:hAnsi="Garamond"/>
+          <w:color w:val="000000"/>
         </w:rPr>
       </w:pPr>
     </w:p>
@@ -668,43 +662,70 @@
       <w:r>
         <w:rPr>
           <w:rFonts w:ascii="Garamond" w:hAnsi="Garamond"/>
-        </w:rPr>
-        <w:t xml:space="preserve">Look at the top of the hard drive. How many </w:t>
-      </w:r>
-      <w:r>
-        <w:rPr>
-          <w:rFonts w:ascii="Garamond" w:hAnsi="Garamond"/>
-        </w:rPr>
-        <w:t>G</w:t>
-      </w:r>
-      <w:r>
-        <w:rPr>
-          <w:rFonts w:ascii="Garamond" w:hAnsi="Garamond"/>
-        </w:rPr>
-        <w:t>Bs does it store? In English, explain what this means.</w:t>
-      </w:r>
-    </w:p>
-    <w:p>
-      <w:pPr>
-        <w:pStyle w:val="Standard"/>
-        <w:rPr>
-          <w:rFonts w:ascii="Garamond" w:hAnsi="Garamond"/>
-        </w:rPr>
-      </w:pPr>
-    </w:p>
-    <w:p>
-      <w:pPr>
-        <w:pStyle w:val="Standard"/>
-        <w:rPr>
-          <w:rFonts w:ascii="Garamond" w:hAnsi="Garamond"/>
-        </w:rPr>
-      </w:pPr>
-    </w:p>
-    <w:p>
-      <w:pPr>
-        <w:pStyle w:val="Standard"/>
-        <w:rPr>
-          <w:rFonts w:ascii="Garamond" w:hAnsi="Garamond"/>
+          <w:color w:val="000000"/>
+        </w:rPr>
+        <w:t xml:space="preserve">Look at the </w:t>
+      </w:r>
+      <w:r>
+        <w:rPr>
+          <w:rFonts w:ascii="Garamond" w:hAnsi="Garamond"/>
+          <w:color w:val="000000"/>
+        </w:rPr>
+        <w:t>sticker on the sides</w:t>
+      </w:r>
+      <w:r>
+        <w:rPr>
+          <w:rFonts w:ascii="Garamond" w:hAnsi="Garamond"/>
+          <w:color w:val="000000"/>
+        </w:rPr>
+        <w:t xml:space="preserve"> of one of the </w:t>
+      </w:r>
+      <w:proofErr w:type="gramStart"/>
+      <w:r>
+        <w:rPr>
+          <w:rFonts w:ascii="Garamond" w:hAnsi="Garamond"/>
+          <w:color w:val="000000"/>
+        </w:rPr>
+        <w:t>memory</w:t>
+      </w:r>
+      <w:proofErr w:type="gramEnd"/>
+      <w:r>
+        <w:rPr>
+          <w:rFonts w:ascii="Garamond" w:hAnsi="Garamond"/>
+          <w:color w:val="000000"/>
+        </w:rPr>
+        <w:t xml:space="preserve"> </w:t>
+      </w:r>
+      <w:r>
+        <w:rPr>
+          <w:rFonts w:ascii="Garamond" w:hAnsi="Garamond"/>
+          <w:color w:val="000000"/>
+        </w:rPr>
+        <w:t xml:space="preserve">(RAM) </w:t>
+      </w:r>
+      <w:r>
+        <w:rPr>
+          <w:rFonts w:ascii="Garamond" w:hAnsi="Garamond"/>
+          <w:color w:val="000000"/>
+        </w:rPr>
+        <w:t>sticks. How many GBs does it store? In English, explain what this means.</w:t>
+      </w:r>
+    </w:p>
+    <w:p>
+      <w:pPr>
+        <w:pStyle w:val="Standard"/>
+        <w:rPr>
+          <w:rFonts w:ascii="Garamond" w:hAnsi="Garamond"/>
+          <w:color w:val="000000"/>
+        </w:rPr>
+      </w:pPr>
+    </w:p>
+    <w:p>
+      <w:pPr>
+        <w:pStyle w:val="Standard"/>
+        <w:rPr>
+          <w:rFonts w:ascii="Garamond" w:hAnsi="Garamond"/>
+          <w:color w:val="000000"/>
         </w:rPr>
       </w:pPr>
     </w:p>
@@ -740,7 +761,21 @@
           <w:rFonts w:ascii="Garamond" w:hAnsi="Garamond"/>
           <w:color w:val="000000"/>
         </w:rPr>
-        <w:t>The Intel 8088 microprocessor from 1981 ran at 4.77 Mhz. How many times faster is your CPU compared to CPUs in 1981?</w:t>
+        <w:t xml:space="preserve">The Intel 8088 </w:t>
+      </w:r>
+      <w:r>
+        <w:rPr>
+          <w:rFonts w:ascii="Garamond" w:hAnsi="Garamond"/>
+          <w:color w:val="000000"/>
+        </w:rPr>
+        <w:t>CPU</w:t>
+      </w:r>
+      <w:r>
+        <w:rPr>
+          <w:rFonts w:ascii="Garamond" w:hAnsi="Garamond"/>
+          <w:color w:val="000000"/>
+        </w:rPr>
+        <w:t xml:space="preserve"> from 1981 ran at 4.77 Mhz. How many times faster is your CPU compared to CPUs in 1981?</w:t>
       </w:r>
     </w:p>
     <w:p>
@@ -793,7 +828,55 @@
         <w:rPr>
           <w:rFonts w:ascii="Garamond" w:hAnsi="Garamond"/>
         </w:rPr>
-        <w:t>The original IBM PC released from 1980 had 640kb in memory. How many times bigger is your memory compared to memory in 1980?</w:t>
+        <w:t>The Seagate ST506 from 1980 had</w:t>
+      </w:r>
+      <w:r>
+        <w:rPr>
+          <w:rFonts w:ascii="Garamond" w:hAnsi="Garamond"/>
+        </w:rPr>
+        <w:t xml:space="preserve"> a</w:t>
+      </w:r>
+      <w:r>
+        <w:rPr>
+          <w:rFonts w:ascii="Garamond" w:hAnsi="Garamond"/>
+        </w:rPr>
+        <w:t xml:space="preserve"> 5mb</w:t>
+      </w:r>
+      <w:r>
+        <w:rPr>
+          <w:rFonts w:ascii="Garamond" w:hAnsi="Garamond"/>
+        </w:rPr>
+        <w:t xml:space="preserve"> hard drive</w:t>
+      </w:r>
+      <w:r>
+        <w:rPr>
+          <w:rFonts w:ascii="Garamond" w:hAnsi="Garamond"/>
+        </w:rPr>
+        <w:t>. How many times bigger is your hard</w:t>
+      </w:r>
+      <w:r>
+        <w:rPr>
+          <w:rFonts w:ascii="Garamond" w:hAnsi="Garamond"/>
+        </w:rPr>
+        <w:t xml:space="preserve"> </w:t>
+      </w:r>
+      <w:r>
+        <w:rPr>
+          <w:rFonts w:ascii="Garamond" w:hAnsi="Garamond"/>
+        </w:rPr>
+        <w:t>drive compared to hard</w:t>
+      </w:r>
+      <w:r>
+        <w:rPr>
+          <w:rFonts w:ascii="Garamond" w:hAnsi="Garamond"/>
+        </w:rPr>
+        <w:t xml:space="preserve"> </w:t>
+      </w:r>
+      <w:r>
+        <w:rPr>
+          <w:rFonts w:ascii="Garamond" w:hAnsi="Garamond"/>
+        </w:rPr>
+        <w:t>drives in 1980?</w:t>
       </w:r>
     </w:p>
     <w:p>
@@ -843,40 +926,8 @@
         <w:rPr>
           <w:rFonts w:ascii="Garamond" w:hAnsi="Garamond"/>
         </w:rPr>
-        <w:t>The Seagate ST506 released from 1980 had 5mb of storage. How many times bigger is your hard</w:t>
-      </w:r>
-      <w:r>
-        <w:rPr>
-          <w:rFonts w:ascii="Garamond" w:hAnsi="Garamond"/>
-        </w:rPr>
-        <w:t xml:space="preserve"> </w:t>
-      </w:r>
-      <w:r>
-        <w:rPr>
-          <w:rFonts w:ascii="Garamond" w:hAnsi="Garamond"/>
-        </w:rPr>
-        <w:t>drive compared to hard</w:t>
-      </w:r>
-      <w:r>
-        <w:rPr>
-          <w:rFonts w:ascii="Garamond" w:hAnsi="Garamond"/>
-        </w:rPr>
-        <w:t xml:space="preserve"> </w:t>
-      </w:r>
-      <w:r>
-        <w:rPr>
-          <w:rFonts w:ascii="Garamond" w:hAnsi="Garamond"/>
-        </w:rPr>
-        <w:t>drives in 1980?</w:t>
-      </w:r>
-    </w:p>
-    <w:p>
-      <w:pPr>
-        <w:pStyle w:val="Standard"/>
-        <w:rPr>
-          <w:rFonts w:ascii="Garamond" w:hAnsi="Garamond"/>
-        </w:rPr>
-      </w:pPr>
+        <w:t>The original IBM PC from 1980 had 640kb in memory. How many times bigger is your memory compared to memory in 1980?</w:t>
+      </w:r>
     </w:p>
     <w:p>
       <w:pPr>
@@ -937,7 +988,7 @@
         <w:rPr>
           <w:rFonts w:ascii="Garamond" w:hAnsi="Garamond"/>
         </w:rPr>
-        <w:t>the memory</w:t>
+        <w:t>memory</w:t>
       </w:r>
       <w:r>
         <w:rPr>
@@ -958,7 +1009,7 @@
 </file>
 
 <file path=word/numbering.xml><?xml version="1.0" encoding="utf-8"?>
-<w:numbering xmlns:wpc="http://schemas.microsoft.com/office/word/2010/wordprocessingCanvas" xmlns:cx="http://schemas.microsoft.com/office/drawing/2014/chartex" xmlns:cx1="http://schemas.microsoft.com/office/drawing/2015/9/8/chartex" xmlns:cx2="http://schemas.microsoft.com/office/drawing/2015/10/21/chartex" xmlns:cx3="http://schemas.microsoft.com/office/drawing/2016/5/9/chartex" xmlns:cx4="http://schemas.microsoft.com/office/drawing/2016/5/10/chartex" xmlns:cx5="http://schemas.microsoft.com/office/drawing/2016/5/11/chartex" xmlns:cx6="http://schemas.microsoft.com/office/drawing/2016/5/12/chartex" xmlns:cx7="http://schemas.microsoft.com/office/drawing/2016/5/13/chartex" xmlns:cx8="http://schemas.microsoft.com/office/drawing/2016/5/14/chartex" xmlns:mc="http://schemas.openxmlformats.org/markup-compatibility/2006" xmlns:aink="http://schemas.microsoft.com/office/drawing/2016/ink" xmlns:am3d="http://schemas.microsoft.com/office/drawing/2017/model3d" xmlns:o="urn:schemas-microsoft-com:office:office" xmlns:oel="http://schemas.microsoft.com/office/2019/extlst" xmlns:r="http://schemas.openxmlformats.org/officeDocument/2006/relationships" xmlns:m="http://schemas.openxmlformats.org/officeDocument/2006/math" xmlns:v="urn:schemas-microsoft-com:vml" xmlns:wp14="http://schemas.microsoft.com/office/word/2010/wordprocessingDrawing" xmlns:wp="http://schemas.openxmlformats.org/drawingml/2006/wordprocessingDrawing" xmlns:w10="urn:schemas-microsoft-com:office:word" xmlns:w="http://schemas.openxmlformats.org/wordprocessingml/2006/main" xmlns:w14="http://schemas.microsoft.com/office/word/2010/wordml" xmlns:w15="http://schemas.microsoft.com/office/word/2012/wordml" xmlns:w16cex="http://schemas.microsoft.com/office/word/2018/wordml/cex" xmlns:w16cid="http://schemas.microsoft.com/office/word/2016/wordml/cid" xmlns:w16="http://schemas.microsoft.com/office/word/2018/wordml" xmlns:w16sdtdh="http://schemas.microsoft.com/office/word/2020/wordml/sdtdatahash" xmlns:w16se="http://schemas.microsoft.com/office/word/2015/wordml/symex" xmlns:wpg="http://schemas.microsoft.com/office/word/2010/wordprocessingGroup" xmlns:wpi="http://schemas.microsoft.com/office/word/2010/wordprocessingInk" xmlns:wne="http://schemas.microsoft.com/office/word/2006/wordml" xmlns:wps="http://schemas.microsoft.com/office/word/2010/wordprocessingShape" mc:Ignorable="w14 w15 w16se w16cid w16 w16cex w16sdtdh wp14">
+<w:numbering xmlns:wpc="http://schemas.microsoft.com/office/word/2010/wordprocessingCanvas" xmlns:cx="http://schemas.microsoft.com/office/drawing/2014/chartex" xmlns:cx1="http://schemas.microsoft.com/office/drawing/2015/9/8/chartex" xmlns:cx2="http://schemas.microsoft.com/office/drawing/2015/10/21/chartex" xmlns:cx3="http://schemas.microsoft.com/office/drawing/2016/5/9/chartex" xmlns:cx4="http://schemas.microsoft.com/office/drawing/2016/5/10/chartex" xmlns:cx5="http://schemas.microsoft.com/office/drawing/2016/5/11/chartex" xmlns:cx6="http://schemas.microsoft.com/office/drawing/2016/5/12/chartex" xmlns:cx7="http://schemas.microsoft.com/office/drawing/2016/5/13/chartex" xmlns:cx8="http://schemas.microsoft.com/office/drawing/2016/5/14/chartex" xmlns:mc="http://schemas.openxmlformats.org/markup-compatibility/2006" xmlns:aink="http://schemas.microsoft.com/office/drawing/2016/ink" xmlns:am3d="http://schemas.microsoft.com/office/drawing/2017/model3d" xmlns:o="urn:schemas-microsoft-com:office:office" xmlns:oel="http://schemas.microsoft.com/office/2019/extlst" xmlns:r="http://schemas.openxmlformats.org/officeDocument/2006/relationships" xmlns:m="http://schemas.openxmlformats.org/officeDocument/2006/math" xmlns:v="urn:schemas-microsoft-com:vml" xmlns:wp14="http://schemas.microsoft.com/office/word/2010/wordprocessingDrawing" xmlns:wp="http://schemas.openxmlformats.org/drawingml/2006/wordprocessingDrawing" xmlns:w10="urn:schemas-microsoft-com:office:word" xmlns:w="http://schemas.openxmlformats.org/wordprocessingml/2006/main" xmlns:w14="http://schemas.microsoft.com/office/word/2010/wordml" xmlns:w15="http://schemas.microsoft.com/office/word/2012/wordml" xmlns:w16cex="http://schemas.microsoft.com/office/word/2018/wordml/cex" xmlns:w16cid="http://schemas.microsoft.com/office/word/2016/wordml/cid" xmlns:w16="http://schemas.microsoft.com/office/word/2018/wordml" xmlns:w16du="http://schemas.microsoft.com/office/word/2023/wordml/word16du" xmlns:w16sdtdh="http://schemas.microsoft.com/office/word/2020/wordml/sdtdatahash" xmlns:w16se="http://schemas.microsoft.com/office/word/2015/wordml/symex" xmlns:wpg="http://schemas.microsoft.com/office/word/2010/wordprocessingGroup" xmlns:wpi="http://schemas.microsoft.com/office/word/2010/wordprocessingInk" xmlns:wne="http://schemas.microsoft.com/office/word/2006/wordml" xmlns:wps="http://schemas.microsoft.com/office/word/2010/wordprocessingShape" mc:Ignorable="w14 w15 w16se w16cid w16 w16cex w16sdtdh w16du wp14">
   <w:abstractNum w:abstractNumId="0" w15:restartNumberingAfterBreak="0">
     <w:nsid w:val="0E7D071A"/>
     <w:multiLevelType w:val="hybridMultilevel"/>
@@ -1147,7 +1198,7 @@
 </file>
 
 <file path=word/styles.xml><?xml version="1.0" encoding="utf-8"?>
-<w:styles xmlns:mc="http://schemas.openxmlformats.org/markup-compatibility/2006" xmlns:r="http://schemas.openxmlformats.org/officeDocument/2006/relationships" xmlns:w="http://schemas.openxmlformats.org/wordprocessingml/2006/main" xmlns:w14="http://schemas.microsoft.com/office/word/2010/wordml" xmlns:w15="http://schemas.microsoft.com/office/word/2012/wordml" xmlns:w16cex="http://schemas.microsoft.com/office/word/2018/wordml/cex" xmlns:w16cid="http://schemas.microsoft.com/office/word/2016/wordml/cid" xmlns:w16="http://schemas.microsoft.com/office/word/2018/wordml" xmlns:w16sdtdh="http://schemas.microsoft.com/office/word/2020/wordml/sdtdatahash" xmlns:w16se="http://schemas.microsoft.com/office/word/2015/wordml/symex" mc:Ignorable="w14 w15 w16se w16cid w16 w16cex w16sdtdh">
+<w:styles xmlns:mc="http://schemas.openxmlformats.org/markup-compatibility/2006" xmlns:r="http://schemas.openxmlformats.org/officeDocument/2006/relationships" xmlns:w="http://schemas.openxmlformats.org/wordprocessingml/2006/main" xmlns:w14="http://schemas.microsoft.com/office/word/2010/wordml" xmlns:w15="http://schemas.microsoft.com/office/word/2012/wordml" xmlns:w16cex="http://schemas.microsoft.com/office/word/2018/wordml/cex" xmlns:w16cid="http://schemas.microsoft.com/office/word/2016/wordml/cid" xmlns:w16="http://schemas.microsoft.com/office/word/2018/wordml" xmlns:w16du="http://schemas.microsoft.com/office/word/2023/wordml/word16du" xmlns:w16sdtdh="http://schemas.microsoft.com/office/word/2020/wordml/sdtdatahash" xmlns:w16se="http://schemas.microsoft.com/office/word/2015/wordml/symex" mc:Ignorable="w14 w15 w16se w16cid w16 w16cex w16sdtdh w16du">
   <w:docDefaults>
     <w:rPrDefault>
       <w:rPr>

</xml_diff>